<commit_message>
Finalize Wave 0-2 integration and acceptance
</commit_message>
<xml_diff>
--- a/Travel_Intel_Dashboard_PRD_v1.0.docx
+++ b/Travel_Intel_Dashboard_PRD_v1.0.docx
@@ -8654,6 +8654,853 @@
           <w:szCs w:val="22"/>
         </w:rPr>
         <w:t xml:space="preserve">Export PDF 旅遊規劃報告</w:t>
+      </w:r>
+    </w:p>
+    <w:p>
+      <w:pPr>
+        <w:pStyle w:val="Heading1"/>
+      </w:pPr>
+      <w:r>
+        <w:t>8.2 現況盤點與 v1.1 修正建議（2026-05-19）</w:t>
+      </w:r>
+    </w:p>
+    <w:p>
+      <w:r>
+        <w:t>依目前程式碼與本機可執行結果檢視，專案已完成可互動的前後端骨架，但資料層仍大量依賴 mock、隨機值與硬編碼 fallback；因此現階段較適合定位為可操作原型，而非可直接支撐旅遊決策的穩定情報產品。以下建議將目前實作與產品定義重新對齊。</w:t>
+      </w:r>
+    </w:p>
+    <w:p>
+      <w:pPr>
+        <w:pStyle w:val="Heading2"/>
+      </w:pPr>
+      <w:r>
+        <w:t>8.2.1 視覺修改建議</w:t>
+      </w:r>
+    </w:p>
+    <w:p>
+      <w:r>
+        <w:t>• 將 index.html 內的 inline style 收斂回 CSS 設計系統，避免版面、字級、間距與色彩規則分散在 HTML、main.css 與 components.css 三處，降低視覺漂移。</w:t>
+      </w:r>
+    </w:p>
+    <w:p>
+      <w:r>
+        <w:t>• 重新定義 Dashboard 的資訊層級：第一層為查詢條件與追蹤列，第二層為四個 Metric Cards，第三層為趨勢圖與熱力圖，避免目前搜尋、追蹤、圖表資訊同時搶主視覺焦點。</w:t>
+      </w:r>
+    </w:p>
+    <w:p>
+      <w:r>
+        <w:t>• 統一 AI 資料的 badge、banner、tooltip 規則，讓 Dashboard、Flight Search、Price History 對 data_confidence 的顯示位置、顏色與文案一致。</w:t>
+      </w:r>
+    </w:p>
+    <w:p>
+      <w:r>
+        <w:t>• 強化 tab 導航的可辨識性，加入更明確的 active indicator、hover/pressed state 與 aria 語意，讓三個主分頁看起來像產品導航而不是一般按鈕列。</w:t>
+      </w:r>
+    </w:p>
+    <w:p>
+      <w:r>
+        <w:t>• 為熱力圖補上圖例、月份分隔與 hover/popover 視覺規則；目前 PRD 有定義互動，但 UI 規格仍不足以保證可讀性與一致性。</w:t>
+      </w:r>
+    </w:p>
+    <w:p>
+      <w:r>
+        <w:t>• 把 loading、empty、error 三種狀態都設計成面板內的標準視覺狀態，而不是主要依賴 toast；toast 應只處理全域提醒，不應取代內容區狀態反饋。</w:t>
+      </w:r>
+    </w:p>
+    <w:p>
+      <w:r>
+        <w:t>• 正式決定語言切換是否屬於 v1.0 範圍。若保留雙語切換，PRD 應補 i18n 規格；若不保留，建議先移除以減少 header 複雜度。</w:t>
+      </w:r>
+    </w:p>
+    <w:p>
+      <w:pPr>
+        <w:pStyle w:val="Heading2"/>
+      </w:pPr>
+      <w:r>
+        <w:t>8.2.2 功能修改建議</w:t>
+      </w:r>
+    </w:p>
+    <w:p>
+      <w:r>
+        <w:t>• 把 origin、destination、dateRange 定義為全域查詢模型，並明確規範各 tab 是「繼承」還是「覆寫」共享條件，避免目前模組各自持有參數造成狀態不一致。</w:t>
+      </w:r>
+    </w:p>
+    <w:p>
+      <w:r>
+        <w:t>• 將購票建議 Banner 明確固定在 Price History 分頁；目前實作中 advice banner 的 DOM 位置與 PRD 契約不一致，會使資訊架構混亂。</w:t>
+      </w:r>
+    </w:p>
+    <w:p>
+      <w:r>
+        <w:t>• 禁止用 Math.random 直接生成趨勢資料與 YOY 資料。若 v1.0 尚未完成真實歷史資料整合，應改成固定 fixture 或可快取的 snapshot，否則同條件重查會得到不同答案，使用者無法信任分析。</w:t>
+      </w:r>
+    </w:p>
+    <w:p>
+      <w:r>
+        <w:t>• 補齊追蹤分頁的建立、命名、重新查詢週期設定與失敗回報流程，並顯示 last fetched、refreshInterval、最近失敗時間，讓追蹤功能真的可管理。</w:t>
+      </w:r>
+    </w:p>
+    <w:p>
+      <w:r>
+        <w:t>• 新增目的地正規化流程，先把 IATA code 映射為城市名稱或座標後再查 weather 與 AI context；目前直接拿 destination 查天氣，對 NRT、HND 這類代碼並不穩定。</w:t>
+      </w:r>
+    </w:p>
+    <w:p>
+      <w:r>
+        <w:t>• 在 Dashboard、Price History 顯示資料來源與資料時間，至少區分 Amadeus、OpenWeatherMap、Gemini 與 fallback/mock，讓使用者知道哪些數字可直接採信。</w:t>
+      </w:r>
+    </w:p>
+    <w:p>
+      <w:r>
+        <w:t>• 補上 Flight Search 的 compare modal、快速篩選完整規格、無結果狀態與最近一次搜尋保留，讓 Tab 2 從資料表展示提升為可連續使用的搜尋流程。</w:t>
+      </w:r>
+    </w:p>
+    <w:p>
+      <w:r>
+        <w:t>• 把錯誤處理改成「保留舊資料 + 面板內 retry」的模式，這點已在 PRD 7.2 提到，但目前實作仍以 toast 為主，無法支撐穩定操作。</w:t>
+      </w:r>
+    </w:p>
+    <w:p>
+      <w:pPr>
+        <w:pStyle w:val="Heading2"/>
+      </w:pPr>
+      <w:r>
+        <w:t>8.2.3 架構修改建議</w:t>
+      </w:r>
+    </w:p>
+    <w:p>
+      <w:r>
+        <w:t>• 把後端拆成 route layer、service client layer、normalizer layer。每個外部來源都應有自己的 client 與 response mapper，避免 route 直接混雜第三方欄位、mock 邏輯與產品欄位組裝。</w:t>
+      </w:r>
+    </w:p>
+    <w:p>
+      <w:r>
+        <w:t>• 建立 deterministic mock adapter 與 feature flag。開發模式可以使用 mock，但 mock 必須固定、可重現、可標示來源，不能混在正式 handler 中以隨機值回傳。</w:t>
+      </w:r>
+    </w:p>
+    <w:p>
+      <w:r>
+        <w:t>• 定義共享 domain model：SearchContext、DashboardSnapshot、FlightOffer、PriceTrendPoint、BookingAdvice。前後端都對齊同一份欄位契約，避免 DOM ID、API 欄位與 JS 模組各自演化。</w:t>
+      </w:r>
+    </w:p>
+    <w:p>
+      <w:r>
+        <w:t>• 在 server 啟動時加入 .env schema 驗證與 boot-time 檢查，缺少 API key、目的地映射資料或必要設定時直接告警，而不是執行後才在 route 內 fallback。</w:t>
+      </w:r>
+    </w:p>
+    <w:p>
+      <w:r>
+        <w:t>• 加入多層快取：Amadeus token cache 之外，再補 dashboard、price-history、heatmap 的短 TTL 快取，降低免費 API 配額壓力與前端重整抖動。</w:t>
+      </w:r>
+    </w:p>
+    <w:p>
+      <w:r>
+        <w:t>• 將目前以 window.TravelIntel 與 LocalStorage 直接互相耦合的方式收斂成單一 app state/store 模組，提供 subscribe、dispatch、selectors，讓 tab、chart、tracking 的相依關係可預測。</w:t>
+      </w:r>
+    </w:p>
+    <w:p>
+      <w:r>
+        <w:t>• 抽出 destination normalization service，統一處理 IATA、城市名、飯店查詢、weather query 與 Gemini prompt context，避免各 route 各自猜測 destination 的含義。</w:t>
+      </w:r>
+    </w:p>
+    <w:p>
+      <w:r>
+        <w:t>• 補上結構化 logging、request id、source metadata 與 confidence metadata，讓未來排查 API 問題、比對 fallback 命中率與資料品質時有基本觀測能力。</w:t>
+      </w:r>
+    </w:p>
+    <w:p>
+      <w:pPr>
+        <w:pStyle w:val="Heading2"/>
+      </w:pPr>
+      <w:r>
+        <w:t>8.2.4 建議優先順序</w:t>
+      </w:r>
+    </w:p>
+    <w:p>
+      <w:r>
+        <w:t>• P0：移除隨機資料回應、修正 DOM 與 PRD 契約不一致項、建立 destination normalization 與環境設定檢查。</w:t>
+      </w:r>
+    </w:p>
+    <w:p>
+      <w:r>
+        <w:t>• P1：統一設計系統與內容狀態樣式、補上資料來源/新鮮度標示、完成 tracking 與 compare 的完整使用流程。</w:t>
+      </w:r>
+    </w:p>
+    <w:p>
+      <w:r>
+        <w:t>• P2：雙語 i18n 正式化、背景自動重查排程、報表匯出與通知能力。</w:t>
+      </w:r>
+    </w:p>
+    <w:p>
+      <w:pPr>
+        <w:pStyle w:val="Heading1"/>
+      </w:pPr>
+      <w:r>
+        <w:t>8.3 實作任務清單（適用 low-model agent 分派）</w:t>
+      </w:r>
+    </w:p>
+    <w:p>
+      <w:r>
+        <w:t>本節將 v1.1 修正建議轉為可分派的實作任務。原則是每個 low-model agent 只處理單一責任、單一檔案群、單一完成定義；避免跨層修改、避免同時碰前後端共享狀態，並盡量讓每個任務可在一次提交中完成。</w:t>
+      </w:r>
+    </w:p>
+    <w:p>
+      <w:pPr>
+        <w:pStyle w:val="Heading2"/>
+      </w:pPr>
+      <w:r>
+        <w:t>8.3.1 分派原則</w:t>
+      </w:r>
+    </w:p>
+    <w:p>
+      <w:r>
+        <w:t>• 每個 agent 僅擁有一組明確檔案；如需跨檔案修改，必須是同一責任邊界內的檔案群。</w:t>
+      </w:r>
+    </w:p>
+    <w:p>
+      <w:r>
+        <w:t>• 先做 P0 穩定化，再做 P1 體驗與完整流程；P2 只在 P0/P1 驗收後啟動。</w:t>
+      </w:r>
+    </w:p>
+    <w:p>
+      <w:r>
+        <w:t>• low-model agent 任務必須可用文字契約驗收，不能依賴臨場架構判斷。</w:t>
+      </w:r>
+    </w:p>
+    <w:p>
+      <w:r>
+        <w:t>• 所有 mock 資料必須 deterministic；不得再使用 Math.random 生成對外回應。</w:t>
+      </w:r>
+    </w:p>
+    <w:p>
+      <w:r>
+        <w:t>• 所有 agent 都不得變更其他 agent 的 API 欄位名稱、DOM ID、LocalStorage key，除非任務包內明確要求。</w:t>
+      </w:r>
+    </w:p>
+    <w:p>
+      <w:pPr>
+        <w:pStyle w:val="Heading2"/>
+      </w:pPr>
+      <w:r>
+        <w:t>8.3.2 實作 Phase 總覽</w:t>
+      </w:r>
+    </w:p>
+    <w:p>
+      <w:r>
+        <w:t>• Phase 0：穩定化與契約收斂 — 修掉資料隨機性、共享狀態不一致、DOM/PRD 契約偏移。</w:t>
+      </w:r>
+    </w:p>
+    <w:p>
+      <w:r>
+        <w:t>• Phase 1：資料層與後端結構化 — 將 route/service/mock/fallback 正規化，補齊 source metadata、destination normalization、cache。</w:t>
+      </w:r>
+    </w:p>
+    <w:p>
+      <w:r>
+        <w:t>• Phase 2：前端互動與 UI 完整化 — 補齊 tracking、compare、error/empty/loading、badge/banner 一致性。</w:t>
+      </w:r>
+    </w:p>
+    <w:p>
+      <w:r>
+        <w:t>• Phase 3：增量能力 — i18n 正式化、自動重查、匯出與通知預留。</w:t>
+      </w:r>
+    </w:p>
+    <w:p>
+      <w:pPr>
+        <w:pStyle w:val="Heading2"/>
+      </w:pPr>
+      <w:r>
+        <w:t>8.3.3 Phase 0：穩定化與契約收斂</w:t>
+      </w:r>
+    </w:p>
+    <w:p>
+      <w:pPr>
+        <w:pStyle w:val="Heading3"/>
+      </w:pPr>
+      <w:r>
+        <w:t>Agent-P0-A｜DOM 與版面契約收斂</w:t>
+      </w:r>
+    </w:p>
+    <w:p>
+      <w:r>
+        <w:t>• Owner files：public/index.html</w:t>
+      </w:r>
+    </w:p>
+    <w:p>
+      <w:r>
+        <w:t>• 目標：移除與 PRD 不一致的 advice banner / 額外 header 控制項位置問題，確保 tab 區塊、主要容器 ID、banner 位置與 PRD 一致。</w:t>
+      </w:r>
+    </w:p>
+    <w:p>
+      <w:r>
+        <w:t>• 輸出：乾淨的 HTML 結構、移除不必要 inline style、保留必要 script/link 載入順序。</w:t>
+      </w:r>
+    </w:p>
+    <w:p>
+      <w:r>
+        <w:t>• DoD：以靜態檢查可確認 #tab-dashboard、#tab-flights、#tab-price-history、#advice-banner、#toast-container 均存在且位置符合 PRD。</w:t>
+      </w:r>
+    </w:p>
+    <w:p>
+      <w:pPr>
+        <w:pStyle w:val="Heading3"/>
+      </w:pPr>
+      <w:r>
+        <w:t>Agent-P0-B｜共享狀態與 tab refresh 收斂</w:t>
+      </w:r>
+    </w:p>
+    <w:p>
+      <w:r>
+        <w:t>• Owner files：public/js/app.js</w:t>
+      </w:r>
+    </w:p>
+    <w:p>
+      <w:r>
+        <w:t>• 目標：定義單一 currentDestination / dateRange 同步規則，修正切 tab 時 refresh 觸發邏輯，避免 dashboard/charts/priceHistory 各自持有不同查詢值。</w:t>
+      </w:r>
+    </w:p>
+    <w:p>
+      <w:r>
+        <w:t>• 輸出：明確的 state getter/setter、訂閱機制、預設 tab 啟動順序。</w:t>
+      </w:r>
+    </w:p>
+    <w:p>
+      <w:r>
+        <w:t>• DoD：切換 tab 不會產生不同目的地來源；主題切換與 tab refresh 行為互不污染。</w:t>
+      </w:r>
+    </w:p>
+    <w:p>
+      <w:pPr>
+        <w:pStyle w:val="Heading3"/>
+      </w:pPr>
+      <w:r>
+        <w:t>Agent-P0-C｜固定資料樣本與隨機回應移除</w:t>
+      </w:r>
+    </w:p>
+    <w:p>
+      <w:r>
+        <w:t>• Owner files：routes/priceHistory.js, routes/heatmap.js, routes/bookingAdvice.js</w:t>
+      </w:r>
+    </w:p>
+    <w:p>
+      <w:r>
+        <w:t>• 目標：移除 Math.random 與隨機 mock，改成固定 fixture 或 deterministic sample generator。</w:t>
+      </w:r>
+    </w:p>
+    <w:p>
+      <w:r>
+        <w:t>• 輸出：相同 query 參數每次回傳相同結果；回應內可標示 sample/mock 來源。</w:t>
+      </w:r>
+    </w:p>
+    <w:p>
+      <w:r>
+        <w:t>• DoD：同條件重複呼叫 /api/price-history、/api/flight-trend、/api/heatmap、/api/booking-advice 時資料完全一致。</w:t>
+      </w:r>
+    </w:p>
+    <w:p>
+      <w:pPr>
+        <w:pStyle w:val="Heading2"/>
+      </w:pPr>
+      <w:r>
+        <w:t>8.3.4 Phase 1：資料層與後端結構化</w:t>
+      </w:r>
+    </w:p>
+    <w:p>
+      <w:pPr>
+        <w:pStyle w:val="Heading3"/>
+      </w:pPr>
+      <w:r>
+        <w:t>Agent-P1-A｜Amadeus service 正規化</w:t>
+      </w:r>
+    </w:p>
+    <w:p>
+      <w:r>
+        <w:t>• Owner files：services/amadeus.js</w:t>
+      </w:r>
+    </w:p>
+    <w:p>
+      <w:r>
+        <w:t>• 目標：把 token 取得、API 呼叫、normalizer、fallback 分段整理；補齊欄位映射與錯誤結構。</w:t>
+      </w:r>
+    </w:p>
+    <w:p>
+      <w:r>
+        <w:t>• 輸出：searchFlights/searchHotels/getPriceMetrics 穩定回傳產品定義欄位。</w:t>
+      </w:r>
+    </w:p>
+    <w:p>
+      <w:r>
+        <w:t>• DoD：service 檔內不直接混雜 route 專屬邏輯，fallback path 也維持正式欄位格式。</w:t>
+      </w:r>
+    </w:p>
+    <w:p>
+      <w:pPr>
+        <w:pStyle w:val="Heading3"/>
+      </w:pPr>
+      <w:r>
+        <w:t>Agent-P1-B｜Weather 與 destination normalization</w:t>
+      </w:r>
+    </w:p>
+    <w:p>
+      <w:r>
+        <w:t>• Owner files：services/weather.js</w:t>
+      </w:r>
+    </w:p>
+    <w:p>
+      <w:r>
+        <w:t>• 目標：處理 IATA -&gt; 城市名稱或查詢 token 的正規化，避免直接拿 NRT/HND 當城市查詢。</w:t>
+      </w:r>
+    </w:p>
+    <w:p>
+      <w:r>
+        <w:t>• 輸出：getCurrentWeather/getWeatherForecast 接受標準化 destination context。</w:t>
+      </w:r>
+    </w:p>
+    <w:p>
+      <w:r>
+        <w:t>• DoD：weather service 對代碼目的地有明確轉換或 fallback 規則，錯誤時回傳一致格式。</w:t>
+      </w:r>
+    </w:p>
+    <w:p>
+      <w:pPr>
+        <w:pStyle w:val="Heading3"/>
+      </w:pPr>
+      <w:r>
+        <w:t>Agent-P1-C｜Gemini service 契約化</w:t>
+      </w:r>
+    </w:p>
+    <w:p>
+      <w:r>
+        <w:t>• Owner files：services/gemini.js, routes/funScore.js, routes/bookingAdvice.js</w:t>
+      </w:r>
+    </w:p>
+    <w:p>
+      <w:r>
+        <w:t>• 目標：統一 prompt schema、null handling、confidence/source 欄位、AI 錯誤 fallback。</w:t>
+      </w:r>
+    </w:p>
+    <w:p>
+      <w:r>
+        <w:t>• 輸出：fun score 與 booking advice 都能保證 JSON 契約，不把 error 直接混成非契約 payload。</w:t>
+      </w:r>
+    </w:p>
+    <w:p>
+      <w:r>
+        <w:t>• DoD：所有 Gemini route 在失敗時仍回傳可被前端辨識的結構，而不是任意 error object。</w:t>
+      </w:r>
+    </w:p>
+    <w:p>
+      <w:pPr>
+        <w:pStyle w:val="Heading3"/>
+      </w:pPr>
+      <w:r>
+        <w:t>Agent-P1-D｜Dashboard 聚合 route 重構</w:t>
+      </w:r>
+    </w:p>
+    <w:p>
+      <w:r>
+        <w:t>• Owner files：routes/dashboard.js</w:t>
+      </w:r>
+    </w:p>
+    <w:p>
+      <w:r>
+        <w:t>• 目標：把 dashboard route 變成純聚合層，負責組合 flight/hotel/weather/funScore/source metadata，不內嵌硬編碼商業邏輯。</w:t>
+      </w:r>
+    </w:p>
+    <w:p>
+      <w:r>
+        <w:t>• 輸出：單一 dashboard response，含資料來源、時間戳、fallback 標記。</w:t>
+      </w:r>
+    </w:p>
+    <w:p>
+      <w:r>
+        <w:t>• DoD：dashboard route 中不直接寫死 mock fun score 與 hotel delta；所有欄位來源可追溯。</w:t>
+      </w:r>
+    </w:p>
+    <w:p>
+      <w:pPr>
+        <w:pStyle w:val="Heading3"/>
+      </w:pPr>
+      <w:r>
+        <w:t>Agent-P1-E｜後端啟動與環境檢查</w:t>
+      </w:r>
+    </w:p>
+    <w:p>
+      <w:r>
+        <w:t>• Owner files：server.js, .env.example</w:t>
+      </w:r>
+    </w:p>
+    <w:p>
+      <w:r>
+        <w:t>• 目標：補上啟動時的必要 env 檢查、錯誤訊息、路由註冊可讀性與統一錯誤 middleware。</w:t>
+      </w:r>
+    </w:p>
+    <w:p>
+      <w:r>
+        <w:t>• 輸出：缺 key 或設定時有可理解警告；server 啟動流程乾淨。</w:t>
+      </w:r>
+    </w:p>
+    <w:p>
+      <w:r>
+        <w:t>• DoD：server.js 可以看出系統依賴哪些 key、哪些 route、哪些 fallback policy。</w:t>
+      </w:r>
+    </w:p>
+    <w:p>
+      <w:pPr>
+        <w:pStyle w:val="Heading2"/>
+      </w:pPr>
+      <w:r>
+        <w:t>8.3.5 Phase 2：前端互動與 UI 完整化</w:t>
+      </w:r>
+    </w:p>
+    <w:p>
+      <w:pPr>
+        <w:pStyle w:val="Heading3"/>
+      </w:pPr>
+      <w:r>
+        <w:t>Agent-P2-A｜設計系統與狀態樣式收斂</w:t>
+      </w:r>
+    </w:p>
+    <w:p>
+      <w:r>
+        <w:t>• Owner files：public/styles/main.css, public/styles/components.css, public/styles/charts.css</w:t>
+      </w:r>
+    </w:p>
+    <w:p>
+      <w:r>
+        <w:t>• 目標：統一 loading/empty/error/badge/banner/chart/heatmap 視覺規則，回收 HTML inline style。</w:t>
+      </w:r>
+    </w:p>
+    <w:p>
+      <w:r>
+        <w:t>• 輸出：明確 class contract，前端 JS 不需自己內嵌太多視覺樣式。</w:t>
+      </w:r>
+    </w:p>
+    <w:p>
+      <w:r>
+        <w:t>• DoD：metric card、toast、advice banner、heatmap legend、skeleton 樣式完整且可重用。</w:t>
+      </w:r>
+    </w:p>
+    <w:p>
+      <w:pPr>
+        <w:pStyle w:val="Heading3"/>
+      </w:pPr>
+      <w:r>
+        <w:t>Agent-P2-B｜Dashboard tracking 與 fun score 流程</w:t>
+      </w:r>
+    </w:p>
+    <w:p>
+      <w:r>
+        <w:t>• Owner files：public/js/dashboard.js</w:t>
+      </w:r>
+    </w:p>
+    <w:p>
+      <w:r>
+        <w:t>• 目標：補齊 tracking 新增/刪除/命名/最後更新時間/重新查詢流程，並把 fun score slider 與 API 呼叫做成穩定互動。</w:t>
+      </w:r>
+    </w:p>
+    <w:p>
+      <w:r>
+        <w:t>• 輸出：travelintel_tracking 結構被完整使用，dashboard refresh 可預測。</w:t>
+      </w:r>
+    </w:p>
+    <w:p>
+      <w:r>
+        <w:t>• DoD：使用者可以新增追蹤、切換追蹤、重新載入指標，且 100% 維度驗證與 debounce 行為穩定。</w:t>
+      </w:r>
+    </w:p>
+    <w:p>
+      <w:pPr>
+        <w:pStyle w:val="Heading3"/>
+      </w:pPr>
+      <w:r>
+        <w:t>Agent-P2-C｜Charts 視覺化完整化</w:t>
+      </w:r>
+    </w:p>
+    <w:p>
+      <w:r>
+        <w:t>• Owner files：public/js/charts.js</w:t>
+      </w:r>
+    </w:p>
+    <w:p>
+      <w:r>
+        <w:t>• 目標：補齊 heatmap legend、month label、popover、theme redraw 與 reduced-motion 邏輯。</w:t>
+      </w:r>
+    </w:p>
+    <w:p>
+      <w:r>
+        <w:t>• 輸出：trend chart 與 heatmap 具有一致載入、錯誤、重繪行為。</w:t>
+      </w:r>
+    </w:p>
+    <w:p>
+      <w:r>
+        <w:t>• DoD：切 theme 不需 refetch 也能更新配色；heatmap 有完整圖例與可點擊資訊。</w:t>
+      </w:r>
+    </w:p>
+    <w:p>
+      <w:pPr>
+        <w:pStyle w:val="Heading3"/>
+      </w:pPr>
+      <w:r>
+        <w:t>Agent-P2-D｜Flight Search 完整搜尋流程</w:t>
+      </w:r>
+    </w:p>
+    <w:p>
+      <w:r>
+        <w:t>• Owner files：public/js/flightSearch.js</w:t>
+      </w:r>
+    </w:p>
+    <w:p>
+      <w:r>
+        <w:t>• 目標：補齊搜尋表單、排序、filter chip、列展開、compare modal、empty state、retry state。</w:t>
+      </w:r>
+    </w:p>
+    <w:p>
+      <w:r>
+        <w:t>• 輸出：Tab 2 可從查詢到比較完整走完，而不是只渲染列表。</w:t>
+      </w:r>
+    </w:p>
+    <w:p>
+      <w:r>
+        <w:t>• DoD：最多選 3 筆比較、排序不重打 API、無結果時有標準 empty state。</w:t>
+      </w:r>
+    </w:p>
+    <w:p>
+      <w:pPr>
+        <w:pStyle w:val="Heading3"/>
+      </w:pPr>
+      <w:r>
+        <w:t>Agent-P2-E｜Price History 與 Advice Banner 完整化</w:t>
+      </w:r>
+    </w:p>
+    <w:p>
+      <w:r>
+        <w:t>• Owner files：public/js/priceHistory.js</w:t>
+      </w:r>
+    </w:p>
+    <w:p>
+      <w:r>
+        <w:t>• 目標：修正 banner 位置與文案規則，補齊 YOY 圖、全年圖、AI confidence badge、sources 連結。</w:t>
+      </w:r>
+    </w:p>
+    <w:p>
+      <w:r>
+        <w:t>• 輸出：Tab 3 成為獨立可用的分析頁。</w:t>
+      </w:r>
+    </w:p>
+    <w:p>
+      <w:r>
+        <w:t>• DoD：切換 origin/destination/year 會同步更新三組資料與對應圖表，不出現舊 banner 殘留在其他 tab。</w:t>
+      </w:r>
+    </w:p>
+    <w:p>
+      <w:pPr>
+        <w:pStyle w:val="Heading2"/>
+      </w:pPr>
+      <w:r>
+        <w:t>8.3.6 Phase 3：增量能力</w:t>
+      </w:r>
+    </w:p>
+    <w:p>
+      <w:pPr>
+        <w:pStyle w:val="Heading3"/>
+      </w:pPr>
+      <w:r>
+        <w:t>Agent-P3-A｜i18n 正式化或下線</w:t>
+      </w:r>
+    </w:p>
+    <w:p>
+      <w:r>
+        <w:t>• Owner files：public/index.html, public/js/app.js, public/js/dashboard.js, public/js/charts.js, public/js/flightSearch.js, public/js/priceHistory.js</w:t>
+      </w:r>
+    </w:p>
+    <w:p>
+      <w:r>
+        <w:t>• 目標：二選一：要嘛把雙語資源抽成字典系統，要嘛把半成品語言切換移出 v1.0。</w:t>
+      </w:r>
+    </w:p>
+    <w:p>
+      <w:r>
+        <w:t>• DoD：文件與實作對語言能力描述一致，不再維持半實作狀態。</w:t>
+      </w:r>
+    </w:p>
+    <w:p>
+      <w:pPr>
+        <w:pStyle w:val="Heading3"/>
+      </w:pPr>
+      <w:r>
+        <w:t>Agent-P3-B｜背景重查與通知預留</w:t>
+      </w:r>
+    </w:p>
+    <w:p>
+      <w:r>
+        <w:t>• Owner files：public/js/dashboard.js, server.js（若需排程入口）</w:t>
+      </w:r>
+    </w:p>
+    <w:p>
+      <w:r>
+        <w:t>• 目標：為 daily/weekly/onOpen refreshInterval 定義實際行為與未來通知擴充點。</w:t>
+      </w:r>
+    </w:p>
+    <w:p>
+      <w:r>
+        <w:t>• DoD：PRD 與程式碼都能指出背景重查目前做到哪一層、未做到哪一層。</w:t>
+      </w:r>
+    </w:p>
+    <w:p>
+      <w:pPr>
+        <w:pStyle w:val="Heading2"/>
+      </w:pPr>
+      <w:r>
+        <w:t>8.3.7 建議派工順序</w:t>
+      </w:r>
+    </w:p>
+    <w:p>
+      <w:r>
+        <w:t>• Wave 0（可平行）：P0-A, P0-B, P0-C。先把契約、共享狀態、隨機資料拿掉。</w:t>
+      </w:r>
+    </w:p>
+    <w:p>
+      <w:r>
+        <w:t>• Wave 1（可平行）：P1-A, P1-B, P1-C, P1-E。先整理底層 service 與 server 啟動檢查。</w:t>
+      </w:r>
+    </w:p>
+    <w:p>
+      <w:r>
+        <w:t>• Wave 2（接 Wave 1）：P1-D。待 service 契約穩定後再重構 dashboard 聚合。</w:t>
+      </w:r>
+    </w:p>
+    <w:p>
+      <w:r>
+        <w:t>• Wave 3（可平行）：P2-A, P2-B, P2-C, P2-D, P2-E。前端各分頁與設計系統獨立收斂。</w:t>
+      </w:r>
+    </w:p>
+    <w:p>
+      <w:r>
+        <w:t>• Wave 4（選配）：P3-A, P3-B。只在前面驗收後啟動。</w:t>
+      </w:r>
+    </w:p>
+    <w:p>
+      <w:pPr>
+        <w:pStyle w:val="Heading2"/>
+      </w:pPr>
+      <w:r>
+        <w:t>8.3.8 low-model agent 任務模板</w:t>
+      </w:r>
+    </w:p>
+    <w:p>
+      <w:r>
+        <w:t>• 任務描述：只描述單一目標，不混入重構願景。</w:t>
+      </w:r>
+    </w:p>
+    <w:p>
+      <w:r>
+        <w:t>• Owner files：明確列出可修改檔案；禁止修改未列檔案。</w:t>
+      </w:r>
+    </w:p>
+    <w:p>
+      <w:r>
+        <w:t>• Inputs：API 契約、DOM ID、LocalStorage key、CSS class。</w:t>
+      </w:r>
+    </w:p>
+    <w:p>
+      <w:r>
+        <w:t>• Outputs：預期新增或修正的行為。</w:t>
+      </w:r>
+    </w:p>
+    <w:p>
+      <w:r>
+        <w:t>• DoD：可由主控 agent 用靜態檢查或單次手動測試驗收。</w:t>
+      </w:r>
+    </w:p>
+    <w:p>
+      <w:r>
+        <w:t>• Guardrails：不要改欄位名稱、不要擴大 scope、不要順手重寫其他模組。</w:t>
+      </w:r>
+    </w:p>
+    <w:p>
+      <w:r>
+        <w:rPr>
+          <w:b/>
+        </w:rPr>
+        <w:t>8.4 實作進度與驗收里程碑（2026-05-19）</w:t>
+      </w:r>
+    </w:p>
+    <w:p>
+      <w:r>
+        <w:rPr>
+          <w:b/>
+        </w:rPr>
+        <w:t>• 目前狀態：</w:t>
+      </w:r>
+      <w:r>
+        <w:t>Wave 0、Wave 1 已完成並驗收通過；Wave 2 已完成程式整合、語法檢查與 API/runtime 驗收，可視為 Accept，但仍保留少量 UI 收斂事項。</w:t>
+      </w:r>
+    </w:p>
+    <w:p>
+      <w:r>
+        <w:rPr>
+          <w:b/>
+        </w:rPr>
+        <w:t>• Wave 0 驗收摘要：</w:t>
+      </w:r>
+      <w:r>
+        <w:t>已完成 DOM 契約收斂、單一 currentDestination 狀態收斂，以及 price history / heatmap / booking advice 的 deterministic mock 化，重複請求結果穩定。</w:t>
+      </w:r>
+    </w:p>
+    <w:p>
+      <w:r>
+        <w:rPr>
+          <w:b/>
+        </w:rPr>
+        <w:t>• Wave 1 驗收摘要：</w:t>
+      </w:r>
+      <w:r>
+        <w:t>已完成 amadeus / weather / gemini service 契約化、server route gating 調整、dashboard 聚合層重構，並修正 dashboard fallback numeric normalization，避免 null 被誤轉為 0。</w:t>
+      </w:r>
+    </w:p>
+    <w:p>
+      <w:r>
+        <w:rPr>
+          <w:b/>
+        </w:rPr>
+        <w:t>• Wave 2 驗收摘要：</w:t>
+      </w:r>
+      <w:r>
+        <w:t>已完成 dashboard / charts / flightSearch / priceHistory 四支前端模組與三支 CSS 檔的實作落地；前端腳本語法檢查通過，首頁與 dashboard / price-history / heatmap / booking-advice API 均可正常回應。/api/flights 在缺少 Amadeus key 時維持 503 missing_required_env，屬預期行為。</w:t>
+      </w:r>
+    </w:p>
+    <w:p>
+      <w:r>
+        <w:rPr>
+          <w:b/>
+        </w:rPr>
+        <w:t>• 目前接受條件：</w:t>
+      </w:r>
+      <w:r>
+        <w:t>本次驗收屬於 code-level 與 runtime-level 驗收，確認契約、載入順序、啟動路徑與 fallback 行為均成立；尚未完成真正的瀏覽器視覺 smoke test，因此不標記為 fully polished。</w:t>
+      </w:r>
+    </w:p>
+    <w:p>
+      <w:r>
+        <w:rPr>
+          <w:b/>
+        </w:rPr>
+        <w:t>• 待收斂事項：</w:t>
+      </w:r>
+      <w:r>
+        <w:t>1) charts.js 仍有部分 inline style，後續應回收至 CSS。2) flightSearch.js 與 priceHistory.js 目前以 JS 動態注入 controls / modal，後續可視需要收斂回 HTML shell 或明確 component contract。3) priceHistory themechange 目前採重新 fetch，功能可用但仍可優化。</w:t>
+      </w:r>
+    </w:p>
+    <w:p>
+      <w:r>
+        <w:rPr>
+          <w:b/>
+        </w:rPr>
+        <w:t>• 建議下一步：</w:t>
+      </w:r>
+      <w:r>
+        <w:t>可直接進入 Wave 3，或先插入一個 Wave 2.5 UI cleanup 小波次，專門處理 inline style、動態注入結構與視覺一致性。</w:t>
       </w:r>
     </w:p>
     <w:sectPr>

</xml_diff>

<commit_message>
Refine travelintel UI and document fallback behavior
</commit_message>
<xml_diff>
--- a/Travel_Intel_Dashboard_PRD_v1.0.docx
+++ b/Travel_Intel_Dashboard_PRD_v1.0.docx
@@ -9213,6 +9213,79 @@
     <w:p/>
     <w:p/>
     <w:p/>
+    <w:p>
+      <w:r>
+        <w:rPr>
+          <w:b/>
+        </w:rPr>
+        <w:t>8.5 travelintel 模型改版（2026-05-20）</w:t>
+      </w:r>
+    </w:p>
+    <w:p>
+      <w:r>
+        <w:t>產品模型由「好玩指數權重分配」改為「travelintel 七面向時段分析」。</w:t>
+      </w:r>
+    </w:p>
+    <w:p>
+      <w:r>
+        <w:t>新規則：</w:t>
+      </w:r>
+    </w:p>
+    <w:p>
+      <w:r>
+        <w:t>• travelintel 的主輸入為 origin、destination、startDate、endDate。</w:t>
+      </w:r>
+    </w:p>
+    <w:p>
+      <w:r>
+        <w:t>• Gemini 不再根據使用者分配的 7 維度權重計算單一分數。</w:t>
+      </w:r>
+    </w:p>
+    <w:p>
+      <w:r>
+        <w:t>• Gemini 需對 shopping、relaxation、luxury、food、sightseeing、value、festival 七個面向，各自回傳 high / medium / low 與一段短評。</w:t>
+      </w:r>
+    </w:p>
+    <w:p>
+      <w:r>
+        <w:t>• 若 destination 與 dateRange 未改變，按 Search 只刷新機票 / 飯店 / weather，不刷新 travelintel。</w:t>
+      </w:r>
+    </w:p>
+    <w:p>
+      <w:r>
+        <w:t>• Dashboard 後端聚合路由不再直接呼叫 Gemini；Gemini 改由獨立的 /api/travelintel route 管理 cache、cooldown、retry。</w:t>
+      </w:r>
+    </w:p>
+    <w:p>
+      <w:r>
+        <w:t>本輪實作已完成：</w:t>
+      </w:r>
+    </w:p>
+    <w:p>
+      <w:r>
+        <w:t>• 新增 GET /api/travelintel。</w:t>
+      </w:r>
+    </w:p>
+    <w:p>
+      <w:r>
+        <w:t>• 新增 travelintel shared cache。</w:t>
+      </w:r>
+    </w:p>
+    <w:p>
+      <w:r>
+        <w:t>• Dashboard 前端移除 slider-driven fun-score 互動，改為 travelintel 七卡片展示。</w:t>
+      </w:r>
+    </w:p>
+    <w:p>
+      <w:r>
+        <w:t>• travelintel fallback 時顯示狀態，並在 cooldown 後自動重試一次 live。</w:t>
+      </w:r>
+    </w:p>
+    <w:p>
+      <w:r>
+        <w:t>• Quota 提示保留，避免使用者頻繁刷新造成 Gemini 配額耗盡。</w:t>
+      </w:r>
+    </w:p>
     <w:sectPr>
       <w:headerReference w:type="default" r:id="rId7"/>
       <w:footerReference w:type="default" r:id="rId8"/>

</xml_diff>